<commit_message>
add some modification & add Tamra folder
</commit_message>
<xml_diff>
--- a/resume/Resume_Elewah.docx
+++ b/resume/Resume_Elewah.docx
@@ -19,29 +19,7 @@
           <w:sz w:val="28"/>
           <w:szCs w:val="28"/>
         </w:rPr>
-        <w:t xml:space="preserve">Abdelrahman Ahmed Mohamed </w:t>
-      </w:r>
-      <w:proofErr w:type="spellStart"/>
-      <w:r>
-        <w:rPr>
-          <w:rFonts w:ascii="Times New Roman" w:hAnsi="Times New Roman" w:cs="Times New Roman"/>
-          <w:b/>
-          <w:bCs/>
-          <w:sz w:val="28"/>
-          <w:szCs w:val="28"/>
-        </w:rPr>
-        <w:t>Elsayed</w:t>
-      </w:r>
-      <w:proofErr w:type="spellEnd"/>
-      <w:r>
-        <w:rPr>
-          <w:rFonts w:ascii="Times New Roman" w:hAnsi="Times New Roman" w:cs="Times New Roman"/>
-          <w:b/>
-          <w:bCs/>
-          <w:sz w:val="28"/>
-          <w:szCs w:val="28"/>
-        </w:rPr>
-        <w:t xml:space="preserve"> Elewah </w:t>
+        <w:t xml:space="preserve">Abdelrahman Elewah </w:t>
       </w:r>
     </w:p>
     <w:p>
@@ -512,8 +490,8 @@
         <w:gridCol w:w="3370"/>
         <w:gridCol w:w="1034"/>
         <w:gridCol w:w="1034"/>
-        <w:gridCol w:w="2385"/>
-        <w:gridCol w:w="2649"/>
+        <w:gridCol w:w="2386"/>
+        <w:gridCol w:w="2648"/>
       </w:tblGrid>
       <w:tr>
         <w:trPr>
@@ -1524,18 +1502,7 @@
                 <w:u w:val="none"/>
                 <w:shd w:val="clear" w:color="auto" w:fill="FFFFFF"/>
               </w:rPr>
-              <w:t>Electrical</w:t>
-            </w:r>
-            <w:r>
-              <w:rPr>
-                <w:rStyle w:val="Hyperlink"/>
-                <w:b/>
-                <w:bCs/>
-                <w:color w:val="000000" w:themeColor="text1"/>
-                <w:u w:val="none"/>
-                <w:shd w:val="clear" w:color="auto" w:fill="FFFFFF"/>
-              </w:rPr>
-              <w:t xml:space="preserve"> </w:t>
+              <w:t xml:space="preserve">Electrical </w:t>
             </w:r>
             <w:r>
               <w:rPr>
@@ -1852,7 +1819,6 @@
               </w:rPr>
               <w:t xml:space="preserve">using GPS and </w:t>
             </w:r>
-            <w:proofErr w:type="gramStart"/>
             <w:r>
               <w:rPr>
                 <w:rFonts w:ascii="Times New Roman" w:hAnsi="Times New Roman" w:cs="Times New Roman"/>
@@ -1860,17 +1826,7 @@
                 <w:sz w:val="24"/>
                 <w:szCs w:val="24"/>
               </w:rPr>
-              <w:t>GSM</w:t>
-            </w:r>
-            <w:proofErr w:type="gramEnd"/>
-            <w:r>
-              <w:rPr>
-                <w:rFonts w:ascii="Times New Roman" w:hAnsi="Times New Roman" w:cs="Times New Roman"/>
-                <w:color w:val="000000"/>
-                <w:sz w:val="24"/>
-                <w:szCs w:val="24"/>
-              </w:rPr>
-              <w:t xml:space="preserve"> </w:t>
+              <w:t xml:space="preserve">GSM </w:t>
             </w:r>
           </w:p>
           <w:p>
@@ -2063,6 +2019,107 @@
                 <w:sz w:val="24"/>
                 <w:szCs w:val="24"/>
               </w:rPr>
+              <w:t xml:space="preserve">A. Elewah, A. A. Badawi, H. Khalil, S. </w:t>
+            </w:r>
+            <w:proofErr w:type="spellStart"/>
+            <w:r>
+              <w:rPr>
+                <w:sz w:val="24"/>
+                <w:szCs w:val="24"/>
+              </w:rPr>
+              <w:t>Rahnamayan</w:t>
+            </w:r>
+            <w:proofErr w:type="spellEnd"/>
+            <w:r>
+              <w:rPr>
+                <w:sz w:val="24"/>
+                <w:szCs w:val="24"/>
+              </w:rPr>
+              <w:t xml:space="preserve"> and K. </w:t>
+            </w:r>
+            <w:proofErr w:type="spellStart"/>
+            <w:r>
+              <w:rPr>
+                <w:sz w:val="24"/>
+                <w:szCs w:val="24"/>
+              </w:rPr>
+              <w:t>Elgazzar</w:t>
+            </w:r>
+            <w:proofErr w:type="spellEnd"/>
+            <w:r>
+              <w:rPr>
+                <w:sz w:val="24"/>
+                <w:szCs w:val="24"/>
+              </w:rPr>
+              <w:t xml:space="preserve">, "3D-RadViz: </w:t>
+            </w:r>
+            <w:proofErr w:type="gramStart"/>
+            <w:r>
+              <w:rPr>
+                <w:sz w:val="24"/>
+                <w:szCs w:val="24"/>
+              </w:rPr>
+              <w:t>Three Dimensional</w:t>
+            </w:r>
+            <w:proofErr w:type="gramEnd"/>
+            <w:r>
+              <w:rPr>
+                <w:sz w:val="24"/>
+                <w:szCs w:val="24"/>
+              </w:rPr>
+              <w:t xml:space="preserve"> Radial Visualization for Large-Scale Data Visualization," </w:t>
+            </w:r>
+            <w:r>
+              <w:rPr>
+                <w:i/>
+                <w:iCs/>
+                <w:sz w:val="24"/>
+                <w:szCs w:val="24"/>
+              </w:rPr>
+              <w:t>2021 IEEE Congress on Evolutionary Computation (CEC)</w:t>
+            </w:r>
+            <w:r>
+              <w:rPr>
+                <w:sz w:val="24"/>
+                <w:szCs w:val="24"/>
+              </w:rPr>
+              <w:t xml:space="preserve">, 2021, pp. 1037-1046, </w:t>
+            </w:r>
+            <w:proofErr w:type="spellStart"/>
+            <w:r>
+              <w:rPr>
+                <w:sz w:val="24"/>
+                <w:szCs w:val="24"/>
+              </w:rPr>
+              <w:t>doi</w:t>
+            </w:r>
+            <w:proofErr w:type="spellEnd"/>
+            <w:r>
+              <w:rPr>
+                <w:sz w:val="24"/>
+                <w:szCs w:val="24"/>
+              </w:rPr>
+              <w:t>: 10.1109/CEC45853.2021.9504983.</w:t>
+            </w:r>
+          </w:p>
+          <w:p>
+            <w:pPr>
+              <w:pStyle w:val="ListParagraph"/>
+              <w:numPr>
+                <w:ilvl w:val="0"/>
+                <w:numId w:val="25"/>
+              </w:numPr>
+              <w:jc w:val="lowKashida"/>
+              <w:rPr>
+                <w:sz w:val="24"/>
+                <w:szCs w:val="24"/>
+              </w:rPr>
+            </w:pPr>
+            <w:r>
+              <w:rPr>
+                <w:sz w:val="24"/>
+                <w:szCs w:val="24"/>
+              </w:rPr>
               <w:t xml:space="preserve">A Elewah, A Taman, AA </w:t>
             </w:r>
             <w:proofErr w:type="spellStart"/>
@@ -2099,20 +2156,7 @@
             </w:r>
             <w:proofErr w:type="spellStart"/>
             <w:r>
-              <w:fldChar w:fldCharType="begin"/>
-            </w:r>
-            <w:r>
-              <w:instrText xml:space="preserve"> HYPERLINK "https://link.springer.com/chapter/10.1007/978-3-319-65960-2_21" </w:instrText>
-            </w:r>
-            <w:r>
-              <w:fldChar w:fldCharType="separate"/>
-            </w:r>
-            <w:r>
-              <w:rPr>
-                <w:rStyle w:val="Hyperlink"/>
-                <w:rFonts w:ascii="Times New Roman" w:hAnsi="Times New Roman" w:cs="Times New Roman"/>
-                <w:b/>
-                <w:bCs/>
+              <w:rPr>
                 <w:sz w:val="24"/>
                 <w:szCs w:val="24"/>
               </w:rPr>
@@ -2121,10 +2165,6 @@
             <w:proofErr w:type="spellEnd"/>
             <w:r>
               <w:rPr>
-                <w:rStyle w:val="Hyperlink"/>
-                <w:rFonts w:ascii="Times New Roman" w:hAnsi="Times New Roman" w:cs="Times New Roman"/>
-                <w:b/>
-                <w:bCs/>
                 <w:sz w:val="24"/>
                 <w:szCs w:val="24"/>
               </w:rPr>
@@ -2133,10 +2173,6 @@
             <w:proofErr w:type="spellStart"/>
             <w:r>
               <w:rPr>
-                <w:rStyle w:val="Hyperlink"/>
-                <w:rFonts w:ascii="Times New Roman" w:hAnsi="Times New Roman" w:cs="Times New Roman"/>
-                <w:b/>
-                <w:bCs/>
                 <w:sz w:val="24"/>
                 <w:szCs w:val="24"/>
               </w:rPr>
@@ -2145,25 +2181,10 @@
             <w:proofErr w:type="spellEnd"/>
             <w:r>
               <w:rPr>
-                <w:rStyle w:val="Hyperlink"/>
-                <w:rFonts w:ascii="Times New Roman" w:hAnsi="Times New Roman" w:cs="Times New Roman"/>
-                <w:b/>
-                <w:bCs/>
                 <w:sz w:val="24"/>
                 <w:szCs w:val="24"/>
               </w:rPr>
               <w:t xml:space="preserve"> Power SNR MPSK Estimator</w:t>
-            </w:r>
-            <w:r>
-              <w:rPr>
-                <w:rStyle w:val="Hyperlink"/>
-                <w:rFonts w:ascii="Times New Roman" w:hAnsi="Times New Roman" w:cs="Times New Roman"/>
-                <w:b/>
-                <w:bCs/>
-                <w:sz w:val="24"/>
-                <w:szCs w:val="24"/>
-              </w:rPr>
-              <w:fldChar w:fldCharType="end"/>
             </w:r>
             <w:proofErr w:type="gramStart"/>
             <w:r>
@@ -2410,17 +2431,8 @@
                 <w:sz w:val="24"/>
                 <w:szCs w:val="24"/>
               </w:rPr>
-              <w:t xml:space="preserve"> python package that is used in visualizing high dimensional </w:t>
-            </w:r>
-            <w:proofErr w:type="gramStart"/>
-            <w:r>
-              <w:rPr>
-                <w:sz w:val="24"/>
-                <w:szCs w:val="24"/>
-              </w:rPr>
-              <w:t>dataset</w:t>
-            </w:r>
-            <w:proofErr w:type="gramEnd"/>
+              <w:t xml:space="preserve"> python package that is used in visualizing high dimensional dataset</w:t>
+            </w:r>
           </w:p>
           <w:p>
             <w:pPr>
@@ -2627,6 +2639,7 @@
                 <w:sz w:val="24"/>
                 <w:szCs w:val="24"/>
               </w:rPr>
+              <w:lastRenderedPageBreak/>
               <w:t xml:space="preserve">Taking machine learning courses. Click </w:t>
             </w:r>
             <w:hyperlink r:id="rId18" w:history="1">
@@ -2674,6 +2687,193 @@
               </w:rPr>
               <w:t xml:space="preserve">rtifications  </w:t>
             </w:r>
+          </w:p>
+          <w:p>
+            <w:pPr>
+              <w:jc w:val="lowKashida"/>
+              <w:rPr>
+                <w:sz w:val="24"/>
+                <w:szCs w:val="24"/>
+              </w:rPr>
+            </w:pPr>
+          </w:p>
+        </w:tc>
+      </w:tr>
+      <w:tr>
+        <w:trPr>
+          <w:trHeight w:val="193"/>
+        </w:trPr>
+        <w:tc>
+          <w:tcPr>
+            <w:tcW w:w="0" w:type="auto"/>
+            <w:gridSpan w:val="5"/>
+            <w:tcBorders>
+              <w:top w:val="single" w:sz="4" w:space="0" w:color="auto"/>
+              <w:left w:val="nil"/>
+              <w:bottom w:val="single" w:sz="4" w:space="0" w:color="auto"/>
+              <w:right w:val="nil"/>
+            </w:tcBorders>
+            <w:vAlign w:val="center"/>
+          </w:tcPr>
+          <w:p>
+            <w:pPr>
+              <w:jc w:val="lowKashida"/>
+              <w:rPr>
+                <w:sz w:val="24"/>
+                <w:szCs w:val="24"/>
+              </w:rPr>
+            </w:pPr>
+            <w:r>
+              <w:rPr>
+                <w:b/>
+                <w:bCs/>
+                <w:shd w:val="clear" w:color="auto" w:fill="FFFFFF"/>
+              </w:rPr>
+              <w:lastRenderedPageBreak/>
+              <w:t xml:space="preserve">The </w:t>
+            </w:r>
+            <w:r>
+              <w:rPr>
+                <w:b/>
+                <w:bCs/>
+                <w:shd w:val="clear" w:color="auto" w:fill="FFFFFF"/>
+              </w:rPr>
+              <w:t>L</w:t>
+            </w:r>
+            <w:r>
+              <w:rPr>
+                <w:b/>
+                <w:bCs/>
+                <w:shd w:val="clear" w:color="auto" w:fill="FFFFFF"/>
+              </w:rPr>
+              <w:t xml:space="preserve">atest </w:t>
+            </w:r>
+            <w:r>
+              <w:rPr>
+                <w:b/>
+                <w:bCs/>
+                <w:shd w:val="clear" w:color="auto" w:fill="FFFFFF"/>
+              </w:rPr>
+              <w:t>W</w:t>
+            </w:r>
+            <w:r>
+              <w:rPr>
+                <w:b/>
+                <w:bCs/>
+                <w:shd w:val="clear" w:color="auto" w:fill="FFFFFF"/>
+              </w:rPr>
+              <w:t>ork</w:t>
+            </w:r>
+            <w:r>
+              <w:rPr>
+                <w:b/>
+                <w:bCs/>
+                <w:shd w:val="clear" w:color="auto" w:fill="FFFFFF"/>
+              </w:rPr>
+              <w:t>s</w:t>
+            </w:r>
+            <w:r>
+              <w:rPr>
+                <w:b/>
+                <w:bCs/>
+                <w:shd w:val="clear" w:color="auto" w:fill="FFFFFF"/>
+              </w:rPr>
+              <w:t xml:space="preserve"> on </w:t>
+            </w:r>
+            <w:r>
+              <w:rPr>
+                <w:b/>
+                <w:bCs/>
+                <w:shd w:val="clear" w:color="auto" w:fill="FFFFFF"/>
+              </w:rPr>
+              <w:t>The API’s for IoT devices</w:t>
+            </w:r>
+          </w:p>
+        </w:tc>
+      </w:tr>
+      <w:tr>
+        <w:trPr>
+          <w:trHeight w:val="794"/>
+        </w:trPr>
+        <w:tc>
+          <w:tcPr>
+            <w:tcW w:w="0" w:type="auto"/>
+            <w:gridSpan w:val="5"/>
+            <w:tcBorders>
+              <w:top w:val="single" w:sz="4" w:space="0" w:color="auto"/>
+              <w:left w:val="nil"/>
+              <w:bottom w:val="single" w:sz="4" w:space="0" w:color="auto"/>
+              <w:right w:val="nil"/>
+            </w:tcBorders>
+            <w:vAlign w:val="center"/>
+          </w:tcPr>
+          <w:p>
+            <w:pPr>
+              <w:pStyle w:val="ListParagraph"/>
+              <w:numPr>
+                <w:ilvl w:val="0"/>
+                <w:numId w:val="33"/>
+              </w:numPr>
+              <w:jc w:val="lowKashida"/>
+              <w:rPr>
+                <w:sz w:val="24"/>
+                <w:szCs w:val="24"/>
+              </w:rPr>
+            </w:pPr>
+            <w:r>
+              <w:rPr>
+                <w:sz w:val="24"/>
+                <w:szCs w:val="24"/>
+              </w:rPr>
+              <w:t xml:space="preserve">Submitting a paper with a </w:t>
+            </w:r>
+            <w:proofErr w:type="gramStart"/>
+            <w:r>
+              <w:rPr>
+                <w:sz w:val="24"/>
+                <w:szCs w:val="24"/>
+              </w:rPr>
+              <w:t>title :</w:t>
+            </w:r>
+            <w:proofErr w:type="gramEnd"/>
+            <w:r>
+              <w:rPr>
+                <w:sz w:val="24"/>
+                <w:szCs w:val="24"/>
+              </w:rPr>
+              <w:t xml:space="preserve"> </w:t>
+            </w:r>
+            <w:proofErr w:type="spellStart"/>
+            <w:r>
+              <w:rPr>
+                <w:i/>
+                <w:iCs/>
+                <w:sz w:val="24"/>
+                <w:szCs w:val="24"/>
+              </w:rPr>
+              <w:t>ThingsDriver</w:t>
+            </w:r>
+            <w:proofErr w:type="spellEnd"/>
+            <w:r>
+              <w:rPr>
+                <w:i/>
+                <w:iCs/>
+                <w:sz w:val="24"/>
+                <w:szCs w:val="24"/>
+              </w:rPr>
+              <w:t>: Unified Interoperable Driver for IoT Nodes (UIDI)</w:t>
+            </w:r>
+          </w:p>
+          <w:p>
+            <w:pPr>
+              <w:pStyle w:val="ListParagraph"/>
+              <w:ind w:left="1080"/>
+              <w:jc w:val="lowKashida"/>
+              <w:rPr>
+                <w:sz w:val="24"/>
+                <w:szCs w:val="24"/>
+              </w:rPr>
+            </w:pPr>
           </w:p>
         </w:tc>
       </w:tr>
@@ -2779,7 +2979,27 @@
                   <w:sz w:val="24"/>
                   <w:szCs w:val="24"/>
                 </w:rPr>
-                <w:t>InnoEgypt</w:t>
+                <w:t>In</w:t>
+              </w:r>
+              <w:r>
+                <w:rPr>
+                  <w:rStyle w:val="Hyperlink"/>
+                  <w:rFonts w:ascii="Times New Roman" w:hAnsi="Times New Roman" w:cs="Times New Roman"/>
+                  <w:noProof/>
+                  <w:sz w:val="24"/>
+                  <w:szCs w:val="24"/>
+                </w:rPr>
+                <w:t>n</w:t>
+              </w:r>
+              <w:r>
+                <w:rPr>
+                  <w:rStyle w:val="Hyperlink"/>
+                  <w:rFonts w:ascii="Times New Roman" w:hAnsi="Times New Roman" w:cs="Times New Roman"/>
+                  <w:noProof/>
+                  <w:sz w:val="24"/>
+                  <w:szCs w:val="24"/>
+                </w:rPr>
+                <w:t>oEgypt</w:t>
               </w:r>
             </w:hyperlink>
             <w:r>
@@ -4544,6 +4764,7 @@
                 <w:sz w:val="24"/>
                 <w:szCs w:val="24"/>
               </w:rPr>
+              <w:lastRenderedPageBreak/>
               <w:t xml:space="preserve">Good Command of Both Spoken and Written English - </w:t>
             </w:r>
             <w:r>
@@ -4556,7 +4777,6 @@
               </w:rPr>
               <w:t xml:space="preserve">IELTS score </w:t>
             </w:r>
-            <w:proofErr w:type="gramStart"/>
             <w:r>
               <w:rPr>
                 <w:rFonts w:ascii="Times New Roman" w:hAnsi="Times New Roman" w:cs="Times New Roman"/>
@@ -4567,7 +4787,6 @@
               </w:rPr>
               <w:t>6</w:t>
             </w:r>
-            <w:proofErr w:type="gramEnd"/>
           </w:p>
           <w:p>
             <w:pPr>
@@ -4738,7 +4957,6 @@
                 <w:sz w:val="24"/>
                 <w:szCs w:val="24"/>
               </w:rPr>
-              <w:lastRenderedPageBreak/>
               <w:t>“The Egyptian Engineering Day” 2-3 August 2010 smart village</w:t>
             </w:r>
           </w:p>
@@ -5681,7 +5899,7 @@
                 <w:sz w:val="24"/>
                 <w:szCs w:val="24"/>
               </w:rPr>
-              <w:t xml:space="preserve">Study the advantages of using Electronic electricity </w:t>
+              <w:t xml:space="preserve">Study the advantages of using </w:t>
             </w:r>
             <w:proofErr w:type="gramStart"/>
             <w:r>
@@ -5690,9 +5908,17 @@
                 <w:sz w:val="24"/>
                 <w:szCs w:val="24"/>
               </w:rPr>
-              <w:t>meters</w:t>
+              <w:t>Electronic</w:t>
             </w:r>
             <w:proofErr w:type="gramEnd"/>
+            <w:r>
+              <w:rPr>
+                <w:rFonts w:ascii="Times New Roman" w:hAnsi="Times New Roman" w:cs="Times New Roman"/>
+                <w:sz w:val="24"/>
+                <w:szCs w:val="24"/>
+              </w:rPr>
+              <w:t xml:space="preserve"> electricity meters</w:t>
+            </w:r>
           </w:p>
           <w:p>
             <w:pPr>
@@ -5825,68 +6051,6 @@
               </w:r>
             </w:hyperlink>
           </w:p>
-          <w:p>
-            <w:pPr>
-              <w:autoSpaceDE w:val="0"/>
-              <w:autoSpaceDN w:val="0"/>
-              <w:adjustRightInd w:val="0"/>
-              <w:rPr>
-                <w:rFonts w:ascii="Times New Roman" w:eastAsiaTheme="minorHAnsi" w:hAnsi="Times New Roman" w:cs="Times New Roman"/>
-                <w:sz w:val="24"/>
-                <w:szCs w:val="24"/>
-              </w:rPr>
-            </w:pPr>
-            <w:r>
-              <w:rPr>
-                <w:rFonts w:ascii="Times New Roman" w:eastAsiaTheme="minorHAnsi" w:hAnsi="Times New Roman" w:cs="Times New Roman"/>
-                <w:b/>
-                <w:bCs/>
-                <w:sz w:val="24"/>
-                <w:szCs w:val="24"/>
-              </w:rPr>
-              <w:t xml:space="preserve">Date of Birth </w:t>
-            </w:r>
-            <w:r>
-              <w:rPr>
-                <w:rFonts w:ascii="Times New Roman" w:eastAsiaTheme="minorHAnsi" w:hAnsi="Times New Roman" w:cs="Times New Roman"/>
-                <w:sz w:val="24"/>
-                <w:szCs w:val="24"/>
-              </w:rPr>
-              <w:t>15.5.1990</w:t>
-            </w:r>
-          </w:p>
-          <w:p>
-            <w:pPr>
-              <w:autoSpaceDE w:val="0"/>
-              <w:autoSpaceDN w:val="0"/>
-              <w:adjustRightInd w:val="0"/>
-              <w:rPr>
-                <w:rFonts w:ascii="Times New Roman" w:eastAsiaTheme="minorHAnsi" w:hAnsi="Times New Roman" w:cs="Times New Roman"/>
-                <w:b/>
-                <w:bCs/>
-                <w:sz w:val="24"/>
-                <w:szCs w:val="24"/>
-              </w:rPr>
-            </w:pPr>
-            <w:r>
-              <w:rPr>
-                <w:rFonts w:ascii="Times New Roman" w:eastAsiaTheme="minorHAnsi" w:hAnsi="Times New Roman" w:cs="Times New Roman"/>
-                <w:b/>
-                <w:bCs/>
-                <w:sz w:val="24"/>
-                <w:szCs w:val="24"/>
-              </w:rPr>
-              <w:t xml:space="preserve">Passport No </w:t>
-            </w:r>
-            <w:r>
-              <w:rPr>
-                <w:rFonts w:ascii="Times New Roman" w:eastAsiaTheme="minorHAnsi" w:hAnsi="Times New Roman" w:cs="Times New Roman"/>
-                <w:sz w:val="24"/>
-                <w:szCs w:val="24"/>
-              </w:rPr>
-              <w:t>A22926846</w:t>
-            </w:r>
-          </w:p>
         </w:tc>
       </w:tr>
     </w:tbl>
@@ -8632,6 +8796,95 @@
     </w:lvl>
   </w:abstractNum>
   <w:abstractNum w:abstractNumId="26" w15:restartNumberingAfterBreak="0">
+    <w:nsid w:val="6DC31962"/>
+    <w:multiLevelType w:val="hybridMultilevel"/>
+    <w:tmpl w:val="E9727F7C"/>
+    <w:lvl w:ilvl="0" w:tplc="184675FC">
+      <w:start w:val="1"/>
+      <w:numFmt w:val="upperRoman"/>
+      <w:lvlText w:val="%1-"/>
+      <w:lvlJc w:val="left"/>
+      <w:pPr>
+        <w:ind w:left="1080" w:hanging="720"/>
+      </w:pPr>
+      <w:rPr>
+        <w:rFonts w:hint="default"/>
+      </w:rPr>
+    </w:lvl>
+    <w:lvl w:ilvl="1" w:tplc="10090019" w:tentative="1">
+      <w:start w:val="1"/>
+      <w:numFmt w:val="lowerLetter"/>
+      <w:lvlText w:val="%2."/>
+      <w:lvlJc w:val="left"/>
+      <w:pPr>
+        <w:ind w:left="1440" w:hanging="360"/>
+      </w:pPr>
+    </w:lvl>
+    <w:lvl w:ilvl="2" w:tplc="1009001B" w:tentative="1">
+      <w:start w:val="1"/>
+      <w:numFmt w:val="lowerRoman"/>
+      <w:lvlText w:val="%3."/>
+      <w:lvlJc w:val="right"/>
+      <w:pPr>
+        <w:ind w:left="2160" w:hanging="180"/>
+      </w:pPr>
+    </w:lvl>
+    <w:lvl w:ilvl="3" w:tplc="1009000F" w:tentative="1">
+      <w:start w:val="1"/>
+      <w:numFmt w:val="decimal"/>
+      <w:lvlText w:val="%4."/>
+      <w:lvlJc w:val="left"/>
+      <w:pPr>
+        <w:ind w:left="2880" w:hanging="360"/>
+      </w:pPr>
+    </w:lvl>
+    <w:lvl w:ilvl="4" w:tplc="10090019" w:tentative="1">
+      <w:start w:val="1"/>
+      <w:numFmt w:val="lowerLetter"/>
+      <w:lvlText w:val="%5."/>
+      <w:lvlJc w:val="left"/>
+      <w:pPr>
+        <w:ind w:left="3600" w:hanging="360"/>
+      </w:pPr>
+    </w:lvl>
+    <w:lvl w:ilvl="5" w:tplc="1009001B" w:tentative="1">
+      <w:start w:val="1"/>
+      <w:numFmt w:val="lowerRoman"/>
+      <w:lvlText w:val="%6."/>
+      <w:lvlJc w:val="right"/>
+      <w:pPr>
+        <w:ind w:left="4320" w:hanging="180"/>
+      </w:pPr>
+    </w:lvl>
+    <w:lvl w:ilvl="6" w:tplc="1009000F" w:tentative="1">
+      <w:start w:val="1"/>
+      <w:numFmt w:val="decimal"/>
+      <w:lvlText w:val="%7."/>
+      <w:lvlJc w:val="left"/>
+      <w:pPr>
+        <w:ind w:left="5040" w:hanging="360"/>
+      </w:pPr>
+    </w:lvl>
+    <w:lvl w:ilvl="7" w:tplc="10090019" w:tentative="1">
+      <w:start w:val="1"/>
+      <w:numFmt w:val="lowerLetter"/>
+      <w:lvlText w:val="%8."/>
+      <w:lvlJc w:val="left"/>
+      <w:pPr>
+        <w:ind w:left="5760" w:hanging="360"/>
+      </w:pPr>
+    </w:lvl>
+    <w:lvl w:ilvl="8" w:tplc="1009001B" w:tentative="1">
+      <w:start w:val="1"/>
+      <w:numFmt w:val="lowerRoman"/>
+      <w:lvlText w:val="%9."/>
+      <w:lvlJc w:val="right"/>
+      <w:pPr>
+        <w:ind w:left="6480" w:hanging="180"/>
+      </w:pPr>
+    </w:lvl>
+  </w:abstractNum>
+  <w:abstractNum w:abstractNumId="27" w15:restartNumberingAfterBreak="0">
     <w:nsid w:val="6FB37FA2"/>
     <w:multiLevelType w:val="hybridMultilevel"/>
     <w:tmpl w:val="D6D663AA"/>
@@ -8746,7 +8999,7 @@
       </w:rPr>
     </w:lvl>
   </w:abstractNum>
-  <w:abstractNum w:abstractNumId="27" w15:restartNumberingAfterBreak="0">
+  <w:abstractNum w:abstractNumId="28" w15:restartNumberingAfterBreak="0">
     <w:nsid w:val="71B907FD"/>
     <w:multiLevelType w:val="hybridMultilevel"/>
     <w:tmpl w:val="5C0A5306"/>
@@ -8859,7 +9112,7 @@
       </w:rPr>
     </w:lvl>
   </w:abstractNum>
-  <w:abstractNum w:abstractNumId="28" w15:restartNumberingAfterBreak="0">
+  <w:abstractNum w:abstractNumId="29" w15:restartNumberingAfterBreak="0">
     <w:nsid w:val="72A27C9B"/>
     <w:multiLevelType w:val="hybridMultilevel"/>
     <w:tmpl w:val="75EE9566"/>
@@ -8950,7 +9203,7 @@
       </w:pPr>
     </w:lvl>
   </w:abstractNum>
-  <w:abstractNum w:abstractNumId="29" w15:restartNumberingAfterBreak="0">
+  <w:abstractNum w:abstractNumId="30" w15:restartNumberingAfterBreak="0">
     <w:nsid w:val="76B31418"/>
     <w:multiLevelType w:val="hybridMultilevel"/>
     <w:tmpl w:val="DDEE83B8"/>
@@ -9040,7 +9293,7 @@
       </w:pPr>
     </w:lvl>
   </w:abstractNum>
-  <w:abstractNum w:abstractNumId="30" w15:restartNumberingAfterBreak="0">
+  <w:abstractNum w:abstractNumId="31" w15:restartNumberingAfterBreak="0">
     <w:nsid w:val="7A9D396A"/>
     <w:multiLevelType w:val="hybridMultilevel"/>
     <w:tmpl w:val="CD304E6C"/>
@@ -9153,7 +9406,7 @@
       </w:rPr>
     </w:lvl>
   </w:abstractNum>
-  <w:abstractNum w:abstractNumId="31" w15:restartNumberingAfterBreak="0">
+  <w:abstractNum w:abstractNumId="32" w15:restartNumberingAfterBreak="0">
     <w:nsid w:val="7D7D079A"/>
     <w:multiLevelType w:val="hybridMultilevel"/>
     <w:tmpl w:val="DDEE83B8"/>
@@ -9250,10 +9503,10 @@
     <w:abstractNumId w:val="2"/>
   </w:num>
   <w:num w:numId="3">
-    <w:abstractNumId w:val="27"/>
+    <w:abstractNumId w:val="28"/>
   </w:num>
   <w:num w:numId="4">
-    <w:abstractNumId w:val="30"/>
+    <w:abstractNumId w:val="31"/>
   </w:num>
   <w:num w:numId="5">
     <w:abstractNumId w:val="18"/>
@@ -9280,7 +9533,7 @@
     <w:abstractNumId w:val="25"/>
   </w:num>
   <w:num w:numId="13">
-    <w:abstractNumId w:val="29"/>
+    <w:abstractNumId w:val="30"/>
   </w:num>
   <w:num w:numId="14">
     <w:abstractNumId w:val="22"/>
@@ -9289,7 +9542,7 @@
     <w:abstractNumId w:val="16"/>
   </w:num>
   <w:num w:numId="16">
-    <w:abstractNumId w:val="31"/>
+    <w:abstractNumId w:val="32"/>
   </w:num>
   <w:num w:numId="17">
     <w:abstractNumId w:val="11"/>
@@ -9313,10 +9566,10 @@
     <w:abstractNumId w:val="8"/>
   </w:num>
   <w:num w:numId="24">
-    <w:abstractNumId w:val="26"/>
+    <w:abstractNumId w:val="27"/>
   </w:num>
   <w:num w:numId="25">
-    <w:abstractNumId w:val="28"/>
+    <w:abstractNumId w:val="29"/>
   </w:num>
   <w:num w:numId="26">
     <w:abstractNumId w:val="20"/>
@@ -9338,6 +9591,9 @@
   </w:num>
   <w:num w:numId="32">
     <w:abstractNumId w:val="23"/>
+  </w:num>
+  <w:num w:numId="33">
+    <w:abstractNumId w:val="26"/>
   </w:num>
 </w:numbering>
 </file>
@@ -10020,6 +10276,17 @@
       <w:shd w:val="clear" w:color="auto" w:fill="E1DFDD"/>
     </w:rPr>
   </w:style>
+  <w:style w:type="character" w:styleId="Emphasis">
+    <w:name w:val="Emphasis"/>
+    <w:basedOn w:val="DefaultParagraphFont"/>
+    <w:uiPriority w:val="20"/>
+    <w:qFormat/>
+    <w:rsid w:val="00F40287"/>
+    <w:rPr>
+      <w:i/>
+      <w:iCs/>
+    </w:rPr>
+  </w:style>
 </w:styles>
 </file>
 

</xml_diff>

<commit_message>
add UIDI, thingsDriver paper
</commit_message>
<xml_diff>
--- a/resume/Resume_Elewah.docx
+++ b/resume/Resume_Elewah.docx
@@ -1146,25 +1146,7 @@
                 <w:sz w:val="24"/>
                 <w:szCs w:val="24"/>
               </w:rPr>
-              <w:t xml:space="preserve">Handle large classes in learning activities, </w:t>
-            </w:r>
-            <w:proofErr w:type="gramStart"/>
-            <w:r>
-              <w:rPr>
-                <w:rFonts w:asciiTheme="majorBidi" w:hAnsiTheme="majorBidi" w:cstheme="majorBidi"/>
-                <w:sz w:val="24"/>
-                <w:szCs w:val="24"/>
-              </w:rPr>
-              <w:t>grading</w:t>
-            </w:r>
-            <w:proofErr w:type="gramEnd"/>
-            <w:r>
-              <w:rPr>
-                <w:rFonts w:asciiTheme="majorBidi" w:hAnsiTheme="majorBidi" w:cstheme="majorBidi"/>
-                <w:sz w:val="24"/>
-                <w:szCs w:val="24"/>
-              </w:rPr>
-              <w:t xml:space="preserve"> and other administrative activities</w:t>
+              <w:t>Handle large classes in learning activities, grading and other administrative activities</w:t>
             </w:r>
           </w:p>
         </w:tc>
@@ -1580,14 +1562,6 @@
                 <w:color w:val="000000" w:themeColor="text1"/>
                 <w:shd w:val="clear" w:color="auto" w:fill="FFFFFF"/>
               </w:rPr>
-            </w:r>
-            <w:r>
-              <w:rPr>
-                <w:b/>
-                <w:bCs/>
-                <w:color w:val="000000" w:themeColor="text1"/>
-                <w:shd w:val="clear" w:color="auto" w:fill="FFFFFF"/>
-              </w:rPr>
               <w:fldChar w:fldCharType="separate"/>
             </w:r>
             <w:r>
@@ -1755,21 +1729,7 @@
               <w:rPr>
                 <w:color w:val="000000" w:themeColor="text1"/>
               </w:rPr>
-              <w:t xml:space="preserve"> </w:t>
-            </w:r>
-            <w:proofErr w:type="gramStart"/>
-            <w:r>
-              <w:rPr>
-                <w:color w:val="000000" w:themeColor="text1"/>
-              </w:rPr>
-              <w:t>With</w:t>
-            </w:r>
-            <w:proofErr w:type="gramEnd"/>
-            <w:r>
-              <w:rPr>
-                <w:color w:val="000000" w:themeColor="text1"/>
-              </w:rPr>
-              <w:t xml:space="preserve"> </w:t>
+              <w:t xml:space="preserve"> With </w:t>
             </w:r>
             <w:r>
               <w:rPr>
@@ -2119,7 +2079,7 @@
                 <w:sz w:val="24"/>
                 <w:szCs w:val="24"/>
               </w:rPr>
-              <w:t xml:space="preserve">A. Elewah, A. A. Badawi, H. Khalil, S. </w:t>
+              <w:t xml:space="preserve">A. Elewah, W. M. Ibrahim, A. </w:t>
             </w:r>
             <w:proofErr w:type="spellStart"/>
             <w:r>
@@ -2127,7 +2087,7 @@
                 <w:sz w:val="24"/>
                 <w:szCs w:val="24"/>
               </w:rPr>
-              <w:t>Rahnamayan</w:t>
+              <w:t>Rafıkl</w:t>
             </w:r>
             <w:proofErr w:type="spellEnd"/>
             <w:r>
@@ -2151,39 +2111,7 @@
                 <w:sz w:val="24"/>
                 <w:szCs w:val="24"/>
               </w:rPr>
-              <w:t xml:space="preserve">, "3D-RadViz: </w:t>
-            </w:r>
-            <w:proofErr w:type="gramStart"/>
-            <w:r>
-              <w:rPr>
-                <w:sz w:val="24"/>
-                <w:szCs w:val="24"/>
-              </w:rPr>
-              <w:t>Three Dimensional</w:t>
-            </w:r>
-            <w:proofErr w:type="gramEnd"/>
-            <w:r>
-              <w:rPr>
-                <w:sz w:val="24"/>
-                <w:szCs w:val="24"/>
-              </w:rPr>
-              <w:t xml:space="preserve"> Radial Visualization for Large-Scale Data Visualization," </w:t>
-            </w:r>
-            <w:r>
-              <w:rPr>
-                <w:i/>
-                <w:iCs/>
-                <w:sz w:val="24"/>
-                <w:szCs w:val="24"/>
-              </w:rPr>
-              <w:t>2021 IEEE Congress on Evolutionary Computation (CEC)</w:t>
-            </w:r>
-            <w:r>
-              <w:rPr>
-                <w:sz w:val="24"/>
-                <w:szCs w:val="24"/>
-              </w:rPr>
-              <w:t xml:space="preserve">, 2021, pp. 1037-1046, </w:t>
+              <w:t xml:space="preserve">, "ThingsDriver: A Unified Interoperable Driver for IoT Nodes," 2022 International Wireless Communications and Mobile Computing (IWCMC), 2022, pp. 877-882, </w:t>
             </w:r>
             <w:proofErr w:type="spellStart"/>
             <w:r>
@@ -2199,7 +2127,7 @@
                 <w:sz w:val="24"/>
                 <w:szCs w:val="24"/>
               </w:rPr>
-              <w:t>: 10.1109/CEC45853.2021.9504983.</w:t>
+              <w:t>: 10.1109/IWCMC55113.2022.9824989.</w:t>
             </w:r>
           </w:p>
           <w:p>
@@ -2220,6 +2148,91 @@
                 <w:sz w:val="24"/>
                 <w:szCs w:val="24"/>
               </w:rPr>
+              <w:t xml:space="preserve">A. Elewah, A. A. Badawi, H. Khalil, S. </w:t>
+            </w:r>
+            <w:proofErr w:type="spellStart"/>
+            <w:r>
+              <w:rPr>
+                <w:sz w:val="24"/>
+                <w:szCs w:val="24"/>
+              </w:rPr>
+              <w:t>Rahnamayan</w:t>
+            </w:r>
+            <w:proofErr w:type="spellEnd"/>
+            <w:r>
+              <w:rPr>
+                <w:sz w:val="24"/>
+                <w:szCs w:val="24"/>
+              </w:rPr>
+              <w:t xml:space="preserve"> and K. </w:t>
+            </w:r>
+            <w:proofErr w:type="spellStart"/>
+            <w:r>
+              <w:rPr>
+                <w:sz w:val="24"/>
+                <w:szCs w:val="24"/>
+              </w:rPr>
+              <w:t>Elgazzar</w:t>
+            </w:r>
+            <w:proofErr w:type="spellEnd"/>
+            <w:r>
+              <w:rPr>
+                <w:sz w:val="24"/>
+                <w:szCs w:val="24"/>
+              </w:rPr>
+              <w:t>, "3D-RadViz: Three Dimensional Radial Visualization for Large-Scale Data Visualization," </w:t>
+            </w:r>
+            <w:r>
+              <w:rPr>
+                <w:i/>
+                <w:iCs/>
+                <w:sz w:val="24"/>
+                <w:szCs w:val="24"/>
+              </w:rPr>
+              <w:t>2021 IEEE Congress on Evolutionary Computation (CEC)</w:t>
+            </w:r>
+            <w:r>
+              <w:rPr>
+                <w:sz w:val="24"/>
+                <w:szCs w:val="24"/>
+              </w:rPr>
+              <w:t xml:space="preserve">, 2021, pp. 1037-1046, </w:t>
+            </w:r>
+            <w:proofErr w:type="spellStart"/>
+            <w:r>
+              <w:rPr>
+                <w:sz w:val="24"/>
+                <w:szCs w:val="24"/>
+              </w:rPr>
+              <w:t>doi</w:t>
+            </w:r>
+            <w:proofErr w:type="spellEnd"/>
+            <w:r>
+              <w:rPr>
+                <w:sz w:val="24"/>
+                <w:szCs w:val="24"/>
+              </w:rPr>
+              <w:t>: 10.1109/CEC45853.2021.9504983.</w:t>
+            </w:r>
+          </w:p>
+          <w:p>
+            <w:pPr>
+              <w:pStyle w:val="ListParagraph"/>
+              <w:numPr>
+                <w:ilvl w:val="0"/>
+                <w:numId w:val="25"/>
+              </w:numPr>
+              <w:jc w:val="lowKashida"/>
+              <w:rPr>
+                <w:sz w:val="24"/>
+                <w:szCs w:val="24"/>
+              </w:rPr>
+            </w:pPr>
+            <w:r>
+              <w:rPr>
+                <w:sz w:val="24"/>
+                <w:szCs w:val="24"/>
+              </w:rPr>
               <w:t xml:space="preserve">A Elewah, A Taman, AA </w:t>
             </w:r>
             <w:proofErr w:type="spellStart"/>
@@ -2286,7 +2299,6 @@
               </w:rPr>
               <w:t xml:space="preserve"> Power SNR MPSK Estimator</w:t>
             </w:r>
-            <w:proofErr w:type="gramStart"/>
             <w:r>
               <w:rPr>
                 <w:sz w:val="24"/>
@@ -2299,15 +2311,7 @@
                 <w:sz w:val="24"/>
                 <w:szCs w:val="24"/>
               </w:rPr>
-              <w:t xml:space="preserve">   </w:t>
-            </w:r>
-            <w:proofErr w:type="gramEnd"/>
-            <w:r>
-              <w:rPr>
-                <w:sz w:val="24"/>
-                <w:szCs w:val="24"/>
-              </w:rPr>
-              <w:t xml:space="preserve">  </w:t>
+              <w:t xml:space="preserve">     </w:t>
             </w:r>
             <w:r>
               <w:rPr>
@@ -2316,6 +2320,36 @@
               </w:rPr>
               <w:t xml:space="preserve"> 12th International Conference Mechatronics, Brno, Czech Republic  6-8/09/2017. </w:t>
             </w:r>
+          </w:p>
+          <w:p>
+            <w:pPr>
+              <w:pStyle w:val="ListParagraph"/>
+              <w:jc w:val="lowKashida"/>
+              <w:rPr>
+                <w:sz w:val="24"/>
+                <w:szCs w:val="24"/>
+              </w:rPr>
+            </w:pPr>
+          </w:p>
+          <w:p>
+            <w:pPr>
+              <w:pStyle w:val="ListParagraph"/>
+              <w:jc w:val="lowKashida"/>
+              <w:rPr>
+                <w:sz w:val="24"/>
+                <w:szCs w:val="24"/>
+              </w:rPr>
+            </w:pPr>
+          </w:p>
+          <w:p>
+            <w:pPr>
+              <w:pStyle w:val="ListParagraph"/>
+              <w:jc w:val="lowKashida"/>
+              <w:rPr>
+                <w:sz w:val="24"/>
+                <w:szCs w:val="24"/>
+              </w:rPr>
+            </w:pPr>
           </w:p>
         </w:tc>
       </w:tr>
@@ -2350,6 +2384,7 @@
                 <w:bCs/>
                 <w:shd w:val="clear" w:color="auto" w:fill="FFFFFF"/>
               </w:rPr>
+              <w:lastRenderedPageBreak/>
               <w:t xml:space="preserve">The </w:t>
             </w:r>
             <w:r>
@@ -2624,7 +2659,6 @@
                 <w:sz w:val="24"/>
                 <w:szCs w:val="24"/>
               </w:rPr>
-              <w:lastRenderedPageBreak/>
               <w:t>Creating a repository that contain</w:t>
             </w:r>
             <w:r>
@@ -2831,7 +2865,6 @@
                 <w:bCs/>
                 <w:shd w:val="clear" w:color="auto" w:fill="FFFFFF"/>
               </w:rPr>
-              <w:lastRenderedPageBreak/>
               <w:t xml:space="preserve">The </w:t>
             </w:r>
             <w:r>
@@ -2918,7 +2951,14 @@
                 <w:sz w:val="24"/>
                 <w:szCs w:val="24"/>
               </w:rPr>
-              <w:t xml:space="preserve">Accepted </w:t>
+              <w:t>Published</w:t>
+            </w:r>
+            <w:r>
+              <w:rPr>
+                <w:sz w:val="24"/>
+                <w:szCs w:val="24"/>
+              </w:rPr>
+              <w:t xml:space="preserve"> </w:t>
             </w:r>
             <w:r>
               <w:rPr>
@@ -4727,6 +4767,7 @@
                 <w:szCs w:val="24"/>
                 <w:shd w:val="clear" w:color="auto" w:fill="FFFFFF"/>
               </w:rPr>
+              <w:lastRenderedPageBreak/>
               <w:t>C++</w:t>
             </w:r>
           </w:p>
@@ -4942,6 +4983,7 @@
                 <w:szCs w:val="24"/>
                 <w:shd w:val="clear" w:color="auto" w:fill="FFFFFF"/>
               </w:rPr>
+              <w:lastRenderedPageBreak/>
               <w:t>MATLAB</w:t>
             </w:r>
           </w:p>
@@ -5379,23 +5421,13 @@
                 <w:szCs w:val="24"/>
               </w:rPr>
             </w:pPr>
-            <w:proofErr w:type="gramStart"/>
-            <w:r>
-              <w:rPr>
-                <w:rFonts w:ascii="Times New Roman" w:hAnsi="Times New Roman" w:cs="Times New Roman"/>
-                <w:sz w:val="24"/>
-                <w:szCs w:val="24"/>
-              </w:rPr>
-              <w:t>Team work</w:t>
-            </w:r>
-            <w:proofErr w:type="gramEnd"/>
-            <w:r>
-              <w:rPr>
-                <w:rFonts w:ascii="Times New Roman" w:hAnsi="Times New Roman" w:cs="Times New Roman"/>
-                <w:sz w:val="24"/>
-                <w:szCs w:val="24"/>
-              </w:rPr>
-              <w:t xml:space="preserve"> </w:t>
+            <w:r>
+              <w:rPr>
+                <w:rFonts w:ascii="Times New Roman" w:hAnsi="Times New Roman" w:cs="Times New Roman"/>
+                <w:sz w:val="24"/>
+                <w:szCs w:val="24"/>
+              </w:rPr>
+              <w:t xml:space="preserve">Team work </w:t>
             </w:r>
           </w:p>
           <w:p>
@@ -5703,43 +5735,7 @@
         <w:sz w:val="2"/>
         <w:szCs w:val="2"/>
       </w:rPr>
-      <w:t xml:space="preserve">Sports Statistician - Worldwide at Genius Sports Global Please note, if you are in the USA please apply here: Link </w:t>
-    </w:r>
-    <w:proofErr w:type="gramStart"/>
-    <w:r>
-      <w:rPr>
-        <w:color w:val="FFFFFF" w:themeColor="background1"/>
-        <w:sz w:val="2"/>
-        <w:szCs w:val="2"/>
-      </w:rPr>
-      <w:t>to  Sports</w:t>
-    </w:r>
-    <w:proofErr w:type="gramEnd"/>
-    <w:r>
-      <w:rPr>
-        <w:color w:val="FFFFFF" w:themeColor="background1"/>
-        <w:sz w:val="2"/>
-        <w:szCs w:val="2"/>
-      </w:rPr>
-      <w:t xml:space="preserve"> Statistician – USA Only job board  Love sports? Want to get paid while attending games? Do you speak English? We're looking for someone like you. As a member of our global </w:t>
-    </w:r>
-    <w:proofErr w:type="gramStart"/>
-    <w:r>
-      <w:rPr>
-        <w:color w:val="FFFFFF" w:themeColor="background1"/>
-        <w:sz w:val="2"/>
-        <w:szCs w:val="2"/>
-      </w:rPr>
-      <w:t>statisticians</w:t>
-    </w:r>
-    <w:proofErr w:type="gramEnd"/>
-    <w:r>
-      <w:rPr>
-        <w:color w:val="FFFFFF" w:themeColor="background1"/>
-        <w:sz w:val="2"/>
-        <w:szCs w:val="2"/>
-      </w:rPr>
-      <w:t xml:space="preserve"> network, you'll get to attend more sporting events in your area. While you're at a game you'll report the live action back to us through our data collection software. Before attending any matches, you will take part in a training and testing </w:t>
+      <w:t xml:space="preserve">Sports Statistician - Worldwide at Genius Sports Global Please note, if you are in the USA please apply here: Link to  Sports Statistician – USA Only job board  Love sports? Want to get paid while attending games? Do you speak English? We're looking for someone like you. As a member of our global statisticians network, you'll get to attend more sporting events in your area. While you're at a game you'll report the live action back to us through our data collection software. Before attending any matches, you will take part in a training and testing </w:t>
     </w:r>
     <w:proofErr w:type="spellStart"/>
     <w:r>

</xml_diff>